<commit_message>
Drop leftovers from the first version of the workshop
The OpenAPI dump script and its npm command served a contract-check exercise that is not
part of the workshop any more, and the gitleaks allowlist still pointed to the removed
exercises folder. The setup guide now says the first run takes a little over three
minutes, which is what the pipeline takes since browsers install without apt.

Co-Authored-By: Claude Opus 5.5 <noreply@anthropic.com>
</commit_message>
<xml_diff>
--- a/docs/Instrukcja przygotowania - Szybki feedback w CICD.docx
+++ b/docs/Instrukcja przygotowania - Szybki feedback w CICD.docx
@@ -885,7 +885,7 @@
           <w:b w:val="0"/>
           <w:sz w:val="21"/>
         </w:rPr>
-        <w:t xml:space="preserve"> i zaczekaj na zakończenie pierwszego przebiegu. Powinien zakończyć się na zielono i trwać około czterech minut.</w:t>
+        <w:t xml:space="preserve"> i zaczekaj na zakończenie pierwszego przebiegu. Powinien zakończyć się na zielono i trwać nieco ponad trzy minuty.</w:t>
       </w:r>
     </w:p>
     <w:p>
@@ -991,7 +991,7 @@
           <w:b/>
           <w:sz w:val="20"/>
         </w:rPr>
-        <w:t>Cztery minuty to nie błąd, tylko nasz punkt wyjścia.</w:t>
+        <w:t>Trzy minuty to nie błąd, tylko nasz punkt wyjścia.</w:t>
       </w:r>
       <w:r>
         <w:rPr>

</xml_diff>